<commit_message>
Reconcile Stage 1 claims and historical scope
</commit_message>
<xml_diff>
--- a/Literature/notes/expose/expose_final_v16_24jun.docx
+++ b/Literature/notes/expose/expose_final_v16_24jun.docx
@@ -9,6 +9,29 @@
       </w:pPr>
       <w:r>
         <w:t>Exposé — Master's Thesis</w:t>
+      </w:r>
+    </w:p>
+    <w:p>
+      <w:pPr>
+        <w:spacing w:before="120" w:after="200"/>
+        <w:ind w:left="142" w:right="142"/>
+        <w:shd w:fill="FDECEC"/>
+      </w:pPr>
+      <w:r>
+        <w:rPr>
+          <w:b/>
+          <w:color w:val="9C1C1C"/>
+          <w:sz w:val="20"/>
+        </w:rPr>
+        <w:t>HISTORICAL WORKING DRAFT (June 2026) — SUPERSEDED</w:t>
+        <w:br/>
+      </w:r>
+      <w:r>
+        <w:rPr>
+          <w:color w:val="6B1A1A"/>
+          <w:sz w:val="18"/>
+        </w:rPr>
+        <w:t>Retained for provenance; this is not the current methodology or claim basis. The automotive domain, post-study ML path, Cognitive Load Index, HCEye-calibration framing, screening-tool claim, and final validation strategy are superseded or remain open. See Literature/notes/expose/README.md before reuse.</w:t>
       </w:r>
     </w:p>
     <w:p>

</xml_diff>